<commit_message>
docs: expand TDD documentation with detailed testing strategy, coverage, and diagrams
</commit_message>
<xml_diff>
--- a/docs/vetify_PRD.docx
+++ b/docs/vetify_PRD.docx
@@ -3958,6 +3958,7 @@
     <w:p>
       <w:pPr>
         <w:pStyle w:val="Heading2"/>
+        <w:ind w:firstLine="720"/>
         <w:jc w:val="both"/>
         <w:rPr>
           <w:rFonts w:ascii="Calibri" w:hAnsi="Calibri" w:cs="Calibri"/>
@@ -3998,21 +3999,6 @@
         <w:jc w:val="both"/>
         <w:rPr>
           <w:rFonts w:ascii="Calibri" w:hAnsi="Calibri" w:cs="Calibri"/>
-        </w:rPr>
-      </w:pPr>
-      <w:r>
-        <w:rPr>
-          <w:rFonts w:ascii="Calibri" w:hAnsi="Calibri" w:cs="Calibri"/>
-        </w:rPr>
-        <w:t>This diagram shows the overall structure of Vetify and how data moves between its three main layers: The Screen (what the user sees), The Brain (the backend logic server that filters inputs and checks for emergencies), and The Memory (the database and external systems). It explicitly highlights how the location-aware AI engine (RAG) matches user questions with verified medical facts and professional clinic addresses, automatically plotting those physical locations onto the user's map in real-time.</w:t>
-      </w:r>
-    </w:p>
-    <w:p>
-      <w:pPr>
-        <w:spacing w:line="360" w:lineRule="auto"/>
-        <w:jc w:val="both"/>
-        <w:rPr>
-          <w:rFonts w:ascii="Calibri" w:hAnsi="Calibri" w:cs="Calibri"/>
           <w:b/>
           <w:bCs/>
         </w:rPr>
@@ -4025,9 +4011,25 @@
           <w:noProof/>
         </w:rPr>
         <w:drawing>
-          <wp:inline distT="0" distB="0" distL="0" distR="0" wp14:anchorId="256BC8AF" wp14:editId="10567941">
-            <wp:extent cx="5943600" cy="4683760"/>
-            <wp:effectExtent l="0" t="0" r="0" b="2540"/>
+          <wp:anchor distT="0" distB="0" distL="114300" distR="114300" simplePos="0" relativeHeight="251658240" behindDoc="1" locked="0" layoutInCell="1" allowOverlap="1" wp14:anchorId="256BC8AF" wp14:editId="45A544CE">
+            <wp:simplePos x="0" y="0"/>
+            <wp:positionH relativeFrom="column">
+              <wp:posOffset>-351155</wp:posOffset>
+            </wp:positionH>
+            <wp:positionV relativeFrom="paragraph">
+              <wp:posOffset>1115695</wp:posOffset>
+            </wp:positionV>
+            <wp:extent cx="6580505" cy="6687185"/>
+            <wp:effectExtent l="0" t="0" r="0" b="0"/>
+            <wp:wrapTight wrapText="bothSides">
+              <wp:wrapPolygon edited="0">
+                <wp:start x="0" y="0"/>
+                <wp:lineTo x="0" y="21536"/>
+                <wp:lineTo x="21510" y="21536"/>
+                <wp:lineTo x="21510" y="0"/>
+                <wp:lineTo x="0" y="0"/>
+              </wp:wrapPolygon>
+            </wp:wrapTight>
             <wp:docPr id="3599625" name="Picture 3"/>
             <wp:cNvGraphicFramePr>
               <a:graphicFrameLocks xmlns:a="http://schemas.openxmlformats.org/drawingml/2006/main" noChangeAspect="1"/>
@@ -4054,7 +4056,7 @@
                   <pic:spPr>
                     <a:xfrm>
                       <a:off x="0" y="0"/>
-                      <a:ext cx="5943600" cy="4683760"/>
+                      <a:ext cx="6580505" cy="6687185"/>
                     </a:xfrm>
                     <a:prstGeom prst="rect">
                       <a:avLst/>
@@ -4063,31 +4065,60 @@
                 </pic:pic>
               </a:graphicData>
             </a:graphic>
-          </wp:inline>
+            <wp14:sizeRelH relativeFrom="margin">
+              <wp14:pctWidth>0</wp14:pctWidth>
+            </wp14:sizeRelH>
+          </wp:anchor>
         </w:drawing>
       </w:r>
-    </w:p>
-    <w:p>
-      <w:pPr>
-        <w:spacing w:line="360" w:lineRule="auto"/>
-        <w:jc w:val="both"/>
-        <w:rPr>
-          <w:rFonts w:ascii="Calibri" w:hAnsi="Calibri" w:cs="Calibri"/>
-          <w:b/>
-          <w:bCs/>
-        </w:rPr>
-      </w:pPr>
-    </w:p>
-    <w:p>
-      <w:pPr>
-        <w:spacing w:line="360" w:lineRule="auto"/>
-        <w:jc w:val="both"/>
-        <w:rPr>
-          <w:rFonts w:ascii="Calibri" w:hAnsi="Calibri" w:cs="Calibri"/>
-          <w:b/>
-          <w:bCs/>
-        </w:rPr>
-      </w:pPr>
+      <w:r>
+        <w:rPr>
+          <w:rFonts w:ascii="Calibri" w:hAnsi="Calibri" w:cs="Calibri"/>
+        </w:rPr>
+        <w:t xml:space="preserve">This diagram maps Vetify’s three main layers: </w:t>
+      </w:r>
+      <w:r>
+        <w:rPr>
+          <w:rFonts w:ascii="Calibri" w:hAnsi="Calibri" w:cs="Calibri"/>
+          <w:b/>
+          <w:bCs/>
+        </w:rPr>
+        <w:t>The Screen</w:t>
+      </w:r>
+      <w:r>
+        <w:rPr>
+          <w:rFonts w:ascii="Calibri" w:hAnsi="Calibri" w:cs="Calibri"/>
+        </w:rPr>
+        <w:t xml:space="preserve"> (frontend UI), </w:t>
+      </w:r>
+      <w:r>
+        <w:rPr>
+          <w:rFonts w:ascii="Calibri" w:hAnsi="Calibri" w:cs="Calibri"/>
+          <w:b/>
+          <w:bCs/>
+        </w:rPr>
+        <w:t>The Brain</w:t>
+      </w:r>
+      <w:r>
+        <w:rPr>
+          <w:rFonts w:ascii="Calibri" w:hAnsi="Calibri" w:cs="Calibri"/>
+        </w:rPr>
+        <w:t xml:space="preserve"> (backend safety and logic), and </w:t>
+      </w:r>
+      <w:r>
+        <w:rPr>
+          <w:rFonts w:ascii="Calibri" w:hAnsi="Calibri" w:cs="Calibri"/>
+          <w:b/>
+          <w:bCs/>
+        </w:rPr>
+        <w:t>The Memory</w:t>
+      </w:r>
+      <w:r>
+        <w:rPr>
+          <w:rFonts w:ascii="Calibri" w:hAnsi="Calibri" w:cs="Calibri"/>
+        </w:rPr>
+        <w:t xml:space="preserve"> (databases). It shows how the location-aware AI engine (RAG) matches user queries with verified medical facts and clinic addresses, automatically plotting those physical locations onto the map in real-time.</w:t>
+      </w:r>
     </w:p>
     <w:p>
       <w:pPr>

</xml_diff>

<commit_message>
docs(TDD): add a TDD docs file
</commit_message>
<xml_diff>
--- a/docs/vetify_PRD.docx
+++ b/docs/vetify_PRD.docx
@@ -798,7 +798,7 @@
           <w:sz w:val="24"/>
           <w:szCs w:val="24"/>
         </w:rPr>
-        <w:t>2.</w:t>
+        <w:t xml:space="preserve">2.2 </w:t>
       </w:r>
       <w:r>
         <w:rPr>
@@ -809,7 +809,7 @@
           <w:sz w:val="24"/>
           <w:szCs w:val="24"/>
         </w:rPr>
-        <w:t>2</w:t>
+        <w:t>Professional Account</w:t>
       </w:r>
       <w:r>
         <w:rPr>
@@ -831,28 +831,6 @@
           <w:sz w:val="24"/>
           <w:szCs w:val="24"/>
         </w:rPr>
-        <w:t>Professional Account</w:t>
-      </w:r>
-      <w:r>
-        <w:rPr>
-          <w:rFonts w:ascii="Calibri" w:hAnsi="Calibri" w:cs="Calibri"/>
-          <w:b/>
-          <w:bCs/>
-          <w:color w:val="000000" w:themeColor="text1"/>
-          <w:sz w:val="24"/>
-          <w:szCs w:val="24"/>
-        </w:rPr>
-        <w:t xml:space="preserve"> </w:t>
-      </w:r>
-      <w:r>
-        <w:rPr>
-          <w:rFonts w:ascii="Calibri" w:hAnsi="Calibri" w:cs="Calibri"/>
-          <w:b/>
-          <w:bCs/>
-          <w:color w:val="000000" w:themeColor="text1"/>
-          <w:sz w:val="24"/>
-          <w:szCs w:val="24"/>
-        </w:rPr>
         <w:t>Approval State</w:t>
       </w:r>
     </w:p>
@@ -881,6 +859,7 @@
       <w:r>
         <w:rPr>
           <w:rFonts w:ascii="Calibri" w:hAnsi="Calibri" w:cs="Calibri"/>
+          <w:noProof/>
         </w:rPr>
         <w:drawing>
           <wp:inline distT="0" distB="0" distL="0" distR="0" wp14:anchorId="5FC052D8" wp14:editId="438518E1">
@@ -3862,6 +3841,7 @@
       <w:r>
         <w:rPr>
           <w:rFonts w:ascii="Calibri" w:hAnsi="Calibri" w:cs="Calibri"/>
+          <w:noProof/>
         </w:rPr>
         <w:drawing>
           <wp:inline distT="0" distB="0" distL="0" distR="0" wp14:anchorId="155A11D7" wp14:editId="0534E12F">
@@ -4189,18 +4169,7 @@
           <w:sz w:val="24"/>
           <w:szCs w:val="24"/>
         </w:rPr>
-        <w:t xml:space="preserve">5.1 Color </w:t>
-      </w:r>
-      <w:r>
-        <w:rPr>
-          <w:rFonts w:ascii="Calibri" w:hAnsi="Calibri" w:cs="Calibri"/>
-          <w:b/>
-          <w:bCs/>
-          <w:color w:val="000000" w:themeColor="text1"/>
-          <w:sz w:val="24"/>
-          <w:szCs w:val="24"/>
-        </w:rPr>
-        <w:t>Palette</w:t>
+        <w:t>5.1 Color Palette</w:t>
       </w:r>
     </w:p>
     <w:p>
@@ -4419,29 +4388,7 @@
           <w:sz w:val="24"/>
           <w:szCs w:val="24"/>
         </w:rPr>
-        <w:t>5.</w:t>
-      </w:r>
-      <w:r>
-        <w:rPr>
-          <w:rFonts w:ascii="Calibri" w:hAnsi="Calibri" w:cs="Calibri"/>
-          <w:b/>
-          <w:bCs/>
-          <w:color w:val="000000" w:themeColor="text1"/>
-          <w:sz w:val="24"/>
-          <w:szCs w:val="24"/>
-        </w:rPr>
-        <w:t>3</w:t>
-      </w:r>
-      <w:r>
-        <w:rPr>
-          <w:rFonts w:ascii="Calibri" w:hAnsi="Calibri" w:cs="Calibri"/>
-          <w:b/>
-          <w:bCs/>
-          <w:color w:val="000000" w:themeColor="text1"/>
-          <w:sz w:val="24"/>
-          <w:szCs w:val="24"/>
-        </w:rPr>
-        <w:t xml:space="preserve"> Visual Feedback &amp; State Transitions</w:t>
+        <w:t>5.3 Visual Feedback &amp; State Transitions</w:t>
       </w:r>
     </w:p>
     <w:p>
@@ -5121,21 +5068,7 @@
               <w:rPr>
                 <w:rFonts w:ascii="Calibri" w:hAnsi="Calibri" w:cs="Calibri"/>
               </w:rPr>
-              <w:t xml:space="preserve">Uses streaming text response models via </w:t>
-            </w:r>
-            <w:proofErr w:type="spellStart"/>
-            <w:r>
-              <w:rPr>
-                <w:rFonts w:ascii="Calibri" w:hAnsi="Calibri" w:cs="Calibri"/>
-              </w:rPr>
-              <w:t>FastAPI</w:t>
-            </w:r>
-            <w:proofErr w:type="spellEnd"/>
-            <w:r>
-              <w:rPr>
-                <w:rFonts w:ascii="Calibri" w:hAnsi="Calibri" w:cs="Calibri"/>
-              </w:rPr>
-              <w:t xml:space="preserve"> to cut latency.</w:t>
+              <w:t>Uses streaming text response models via FastAPI to cut latency.</w:t>
             </w:r>
           </w:p>
         </w:tc>
@@ -5449,6 +5382,7 @@
       </w:tr>
       <w:tr>
         <w:trPr>
+          <w:trHeight w:val="1863"/>
           <w:tblCellSpacing w:w="0" w:type="dxa"/>
         </w:trPr>
         <w:tc>
@@ -5674,7 +5608,7 @@
       </w:tr>
       <w:tr>
         <w:trPr>
-          <w:trHeight w:val="1926"/>
+          <w:trHeight w:val="1755"/>
           <w:tblCellSpacing w:w="0" w:type="dxa"/>
         </w:trPr>
         <w:tc>
@@ -8591,6 +8525,7 @@
   <w:style w:type="character" w:default="1" w:styleId="DefaultParagraphFont">
     <w:name w:val="Default Paragraph Font"/>
     <w:uiPriority w:val="1"/>
+    <w:semiHidden/>
     <w:unhideWhenUsed/>
   </w:style>
   <w:style w:type="table" w:default="1" w:styleId="TableNormal">

</xml_diff>